<commit_message>
fix: corrige el final del informe EP3 y elimina el Anexo C
- Quita el Anexo C (extractos de evidencia), que mostraba bytes binarios y líneas cortadas.
- Elimina los restos [trash] heredados de la plantilla y agrega párrafo de cierre cuando
  el cuerpo termina en tabla; el documento pasa la validación de la skill de docx.
- Actualiza textos desactualizados de 3.1 y 4.1 y las propiedades del documento (autores).
- Informe de 28 páginas; README y auditoría interna al día.

Co-Authored-By: Claude Sonnet 5.5 <noreply@anthropic.com>
</commit_message>
<xml_diff>
--- a/04-Entrega/EP3/EP3_ISY1102_Informe_Atlas.docx
+++ b/04-Entrega/EP3/EP3_ISY1102_Informe_Atlas.docx
@@ -1206,7 +1206,7 @@
               <w:rPr>
                 <w:rStyle w:val="Hyperlink"/>
               </w:rPr>
-              <w:t xml:space="preserve">4.1 Casos de prueba representativos</w:t>
+              <w:t xml:space="preserve">4.1 Casos de prueba priorizados</w:t>
             </w:r>
             <w:r>
               <w:tab/>
@@ -1715,43 +1715,6 @@
                 <w:rStyle w:val="Hyperlink"/>
               </w:rPr>
               <w:t>26</w:t>
-            </w:r>
-            <w:r>
-              <w:fldChar w:fldCharType="end"/>
-            </w:r>
-          </w:hyperlink>
-        </w:p>
-        <w:p>
-          <w:pPr>
-            <w:pStyle w:val="TOC1"/>
-            <w:tabs>
-              <w:tab w:val="right" w:leader="dot" w:pos="9735"/>
-            </w:tabs>
-          </w:pPr>
-          <w:hyperlink w:anchor="_Toc9000132">
-            <w:r>
-              <w:rPr>
-                <w:rStyle w:val="Hyperlink"/>
-              </w:rPr>
-              <w:t xml:space="preserve">Anexo C. Extractos de la evidencia de ejecución</w:t>
-            </w:r>
-            <w:r>
-              <w:tab/>
-            </w:r>
-            <w:r>
-              <w:fldChar w:fldCharType="begin"/>
-            </w:r>
-            <w:r>
-              <w:instrText xml:space="preserve">PAGEREF _Toc9000132 \h</w:instrText>
-            </w:r>
-            <w:r>
-              <w:fldChar w:fldCharType="separate"/>
-            </w:r>
-            <w:r>
-              <w:rPr>
-                <w:rStyle w:val="Hyperlink"/>
-              </w:rPr>
-              <w:t>29</w:t>
             </w:r>
             <w:r>
               <w:fldChar w:fldCharType="end"/>
@@ -2894,191 +2857,6 @@
             <w:rStyle w:val="Hyperlink"/>
           </w:rPr>
           <w:t>26</w:t>
-        </w:r>
-        <w:r>
-          <w:fldChar w:fldCharType="end"/>
-        </w:r>
-      </w:hyperlink>
-    </w:p>
-    <w:p>
-      <w:pPr>
-        <w:pStyle w:val="TOC1"/>
-        <w:tabs>
-          <w:tab w:val="right" w:leader="dot" w:pos="9735"/>
-        </w:tabs>
-      </w:pPr>
-      <w:hyperlink w:anchor="_TocTbl31">
-        <w:r>
-          <w:rPr>
-            <w:rStyle w:val="Hyperlink"/>
-          </w:rPr>
-          <w:t xml:space="preserve">Tabla 31. Evidencia PT-SEG-001: contraseñas en la base de datos (PT-SEG-001_01_hash_politica.txt)</w:t>
-        </w:r>
-        <w:r>
-          <w:tab/>
-        </w:r>
-        <w:r>
-          <w:fldChar w:fldCharType="begin"/>
-        </w:r>
-        <w:r>
-          <w:instrText xml:space="preserve">PAGEREF _TocTbl31 \h</w:instrText>
-        </w:r>
-        <w:r>
-          <w:fldChar w:fldCharType="separate"/>
-        </w:r>
-        <w:r>
-          <w:rPr>
-            <w:rStyle w:val="Hyperlink"/>
-          </w:rPr>
-          <w:t>29</w:t>
-        </w:r>
-        <w:r>
-          <w:fldChar w:fldCharType="end"/>
-        </w:r>
-      </w:hyperlink>
-    </w:p>
-    <w:p>
-      <w:pPr>
-        <w:pStyle w:val="TOC1"/>
-        <w:tabs>
-          <w:tab w:val="right" w:leader="dot" w:pos="9735"/>
-        </w:tabs>
-      </w:pPr>
-      <w:hyperlink w:anchor="_TocTbl32">
-        <w:r>
-          <w:rPr>
-            <w:rStyle w:val="Hyperlink"/>
-          </w:rPr>
-          <w:t xml:space="preserve">Tabla 32. Evidencia PT-SEG-002: operaciones del editor (PT-SEG-002_01_rbac.txt)</w:t>
-        </w:r>
-        <w:r>
-          <w:tab/>
-        </w:r>
-        <w:r>
-          <w:fldChar w:fldCharType="begin"/>
-        </w:r>
-        <w:r>
-          <w:instrText xml:space="preserve">PAGEREF _TocTbl32 \h</w:instrText>
-        </w:r>
-        <w:r>
-          <w:fldChar w:fldCharType="separate"/>
-        </w:r>
-        <w:r>
-          <w:rPr>
-            <w:rStyle w:val="Hyperlink"/>
-          </w:rPr>
-          <w:t>29</w:t>
-        </w:r>
-        <w:r>
-          <w:fldChar w:fldCharType="end"/>
-        </w:r>
-      </w:hyperlink>
-    </w:p>
-    <w:p>
-      <w:pPr>
-        <w:pStyle w:val="TOC1"/>
-        <w:tabs>
-          <w:tab w:val="right" w:leader="dot" w:pos="9735"/>
-        </w:tabs>
-      </w:pPr>
-      <w:hyperlink w:anchor="_TocTbl33">
-        <w:r>
-          <w:rPr>
-            <w:rStyle w:val="Hyperlink"/>
-          </w:rPr>
-          <w:t xml:space="preserve">Tabla 33. Evidencia PT-SEG-009: acceso a recursos de otra empresa y sin token (PT-SEG-009_01_aislamiento.txt)</w:t>
-        </w:r>
-        <w:r>
-          <w:tab/>
-        </w:r>
-        <w:r>
-          <w:fldChar w:fldCharType="begin"/>
-        </w:r>
-        <w:r>
-          <w:instrText xml:space="preserve">PAGEREF _TocTbl33 \h</w:instrText>
-        </w:r>
-        <w:r>
-          <w:fldChar w:fldCharType="separate"/>
-        </w:r>
-        <w:r>
-          <w:rPr>
-            <w:rStyle w:val="Hyperlink"/>
-          </w:rPr>
-          <w:t>29</w:t>
-        </w:r>
-        <w:r>
-          <w:fldChar w:fldCharType="end"/>
-        </w:r>
-      </w:hyperlink>
-    </w:p>
-    <w:p>
-      <w:pPr>
-        <w:pStyle w:val="TOC1"/>
-        <w:tabs>
-          <w:tab w:val="right" w:leader="dot" w:pos="9735"/>
-        </w:tabs>
-      </w:pPr>
-      <w:hyperlink w:anchor="_TocTbl34">
-        <w:r>
-          <w:rPr>
-            <w:rStyle w:val="Hyperlink"/>
-          </w:rPr>
-          <w:t xml:space="preserve">Tabla 34. Evidencia PT-SEG-008: token forjado con el secreto por defecto (PT-SEG-008_01_jwt.txt)</w:t>
-        </w:r>
-        <w:r>
-          <w:tab/>
-        </w:r>
-        <w:r>
-          <w:fldChar w:fldCharType="begin"/>
-        </w:r>
-        <w:r>
-          <w:instrText xml:space="preserve">PAGEREF _TocTbl34 \h</w:instrText>
-        </w:r>
-        <w:r>
-          <w:fldChar w:fldCharType="separate"/>
-        </w:r>
-        <w:r>
-          <w:rPr>
-            <w:rStyle w:val="Hyperlink"/>
-          </w:rPr>
-          <w:t>29</w:t>
-        </w:r>
-        <w:r>
-          <w:fldChar w:fldCharType="end"/>
-        </w:r>
-      </w:hyperlink>
-    </w:p>
-    <w:p>
-      <w:pPr>
-        <w:pStyle w:val="TOC1"/>
-        <w:tabs>
-          <w:tab w:val="right" w:leader="dot" w:pos="9735"/>
-        </w:tabs>
-      </w:pPr>
-      <w:hyperlink w:anchor="_TocTbl35">
-        <w:r>
-          <w:rPr>
-            <w:rStyle w:val="Hyperlink"/>
-          </w:rPr>
-          <w:t xml:space="preserve">Tabla 35. Evidencia PT-PERF-001: latencia por endpoint con k6 (PT-PERF-001_01_k6.txt)</w:t>
-        </w:r>
-        <w:r>
-          <w:tab/>
-        </w:r>
-        <w:r>
-          <w:fldChar w:fldCharType="begin"/>
-        </w:r>
-        <w:r>
-          <w:instrText xml:space="preserve">PAGEREF _TocTbl35 \h</w:instrText>
-        </w:r>
-        <w:r>
-          <w:fldChar w:fldCharType="separate"/>
-        </w:r>
-        <w:r>
-          <w:rPr>
-            <w:rStyle w:val="Hyperlink"/>
-          </w:rPr>
-          <w:t>30</w:t>
         </w:r>
         <w:r>
           <w:fldChar w:fldCharType="end"/>
@@ -3632,7 +3410,7 @@
                 <w:szCs w:val="20"/>
                 <w:lang w:val="es-ES"/>
               </w:rPr>
-              <w:t xml:space="preserve">Resultado verificado y con evidencia para cada RF y RB.</w:t>
+              <w:t xml:space="preserve">Resultado verificado y con evidencia para cada RF y RB del alcance.</w:t>
             </w:r>
           </w:p>
         </w:tc>
@@ -5927,7 +5705,7 @@
           <w:szCs w:val="22"/>
           <w:lang w:val="es-ES"/>
         </w:rPr>
-        <w:t xml:space="preserve">: se automatiza lo repetible y medible (API, carga, escaneo de código y de la aplicación) y se ejecuta manualmente lo que exige juicio humano (accesibilidad con usuarios, compatibilidad, revisión de código). La seguridad tiene prioridad porque Atlas maneja datos personales.</w:t>
+        <w:t xml:space="preserve">: se automatiza lo repetible y medible (API, carga, escaneo de código y de la aplicación) y se ejecuta manualmente lo que exige juicio humano (revisión de código e interpretación de los resultados de las herramientas). La seguridad tiene prioridad porque Atlas maneja datos personales.</w:t>
       </w:r>
     </w:p>
     <w:p>
@@ -5959,7 +5737,7 @@
           <w:szCs w:val="22"/>
           <w:lang w:val="es-ES"/>
         </w:rPr>
-        <w:t xml:space="preserve"> SAST (análisis estático), DAST (aplicación en ejecución) y pruebas manuales de caja negra basadas en el ERS.</w:t>
+        <w:t xml:space="preserve"> SAST (análisis estático), DAST (aplicación en ejecución) y pruebas de caja negra basadas en el ERS, ejecutadas con scripts reproducibles.</w:t>
       </w:r>
     </w:p>
     <w:p>
@@ -5991,7 +5769,7 @@
           <w:szCs w:val="22"/>
           <w:lang w:val="es-ES"/>
         </w:rPr>
-        <w:t xml:space="preserve"> preparación del entorno y datos ficticios; análisis estático; pruebas funcionales vía API; seguridad de autenticación y autorización; seguridad dinámica; rendimiento; usabilidad y compatibilidad; disponibilidad y recuperación; consolidación de incidentes y matriz.</w:t>
+        <w:t xml:space="preserve"> preparación del entorno y datos ficticios; análisis estático; pruebas funcionales vía API; seguridad de autenticación y autorización; seguridad dinámica; rendimiento; accesibilidad; consolidación de incidentes y matriz.</w:t>
       </w:r>
     </w:p>
     <w:p>
@@ -6023,7 +5801,7 @@
           <w:szCs w:val="22"/>
           <w:lang w:val="es-ES"/>
         </w:rPr>
-        <w:t xml:space="preserve"> P1 seguridad (autenticación, autorización, datos) y funciones núcleo (login, clientes, contratos); P2 rendimiento, usabilidad y disponibilidad; P3 compatibilidad (justificación en la sección 4.2).</w:t>
+        <w:t xml:space="preserve"> P1 seguridad (autenticación, autorización, datos) y funciones núcleo (login, clientes, contratos); P2 rendimiento, accesibilidad y trazabilidad (auditoría); compatibilidad y disponibilidad quedan fuera del alcance de este ciclo (sección 1.2).</w:t>
       </w:r>
     </w:p>
     <w:p>
@@ -6087,7 +5865,7 @@
           <w:szCs w:val="22"/>
           <w:lang w:val="es-ES"/>
         </w:rPr>
-        <w:t xml:space="preserve"> casos P1 ejecutados con evidencia; casos P2 y P3 ejecutados según el tiempo disponible, informando la cobertura de ejecución real; incidentes clasificados y trazados a su caso y requerimiento; matriz actualizada.</w:t>
+        <w:t xml:space="preserve"> casos P1 y P2 ejecutados con evidencia, informando la cobertura de ejecución real; incidentes clasificados y trazados a su caso y requerimiento; matriz actualizada.</w:t>
       </w:r>
     </w:p>
     <w:p>
@@ -6119,7 +5897,7 @@
           <w:szCs w:val="22"/>
           <w:lang w:val="es-ES"/>
         </w:rPr>
-        <w:t xml:space="preserve"> la re-ejecución de los casos fallidos se diseña para después de corregir el código; no se ejecuta en este ciclo porque la corrección del sistema no forma parte del encargo.</w:t>
+        <w:t xml:space="preserve"> la re-ejecución de los casos fallidos se diseña para después de corregir el código; no se ejecuta en este ciclo porque la corrección del sistema no forma parte del alcance.</w:t>
       </w:r>
     </w:p>
     <w:p>
@@ -10532,7 +10310,7 @@
           <w:szCs w:val="24"/>
           <w:lang w:val="es-ES"/>
         </w:rPr>
-        <w:t xml:space="preserve">4.1 Casos de prueba representativos</w:t>
+        <w:t xml:space="preserve">4.1 Casos de prueba priorizados</w:t>
       </w:r>
       <w:bookmarkEnd w:id="118"/>
     </w:p>
@@ -36463,1109 +36241,6 @@
         <w:t xml:space="preserve">Figura B.3. Bugs (25): promesas sin manejar en componentes del frontend.</w:t>
       </w:r>
     </w:p>
-    <w:p>
-      <w:pPr>
-        <w:pStyle w:val="Heading1"/>
-        <w:pageBreakBefore/>
-        <w:pBdr>
-          <w:bottom w:val="single" w:sz="6" w:space="2" w:color="808080"/>
-        </w:pBdr>
-        <w:jc w:val="left"/>
-      </w:pPr>
-      <w:bookmarkStart w:id="132" w:name="_Toc9000132"/>
-      <w:r>
-        <w:rPr>
-          <w:rFonts w:ascii="Arial" w:hAnsi="Arial" w:eastAsia="Arial" w:cs="Arial"/>
-          <w:b w:val="1"/>
-          <w:bCs w:val="1"/>
-          <w:sz w:val="24"/>
-          <w:szCs w:val="24"/>
-          <w:lang w:val="es-ES"/>
-        </w:rPr>
-        <w:t xml:space="preserve">Anexo C. Extractos de la evidencia de ejecución</w:t>
-      </w:r>
-      <w:bookmarkEnd w:id="132"/>
-    </w:p>
-    <w:p>
-      <w:pPr>
-        <w:spacing w:before="0" w:after="120" w:line="360" w:lineRule="auto"/>
-        <w:jc w:val="left"/>
-      </w:pPr>
-      <w:r>
-        <w:rPr>
-          <w:rFonts w:ascii="Arial" w:hAnsi="Arial" w:eastAsia="Arial" w:cs="Arial"/>
-          <w:sz w:val="22"/>
-          <w:szCs w:val="22"/>
-          <w:lang w:val="es-ES"/>
-        </w:rPr>
-        <w:t xml:space="preserve">Extractos de los archivos de evidencia guardados en 06-Evidencias/ejecucion/ (cada caso tiene su archivo completo, con peticiones, respuestas y veredicto por criterio).</w:t>
-      </w:r>
-    </w:p>
-    <w:p>
-      <w:pPr>
-        <w:keepNext/>
-        <w:spacing w:before="120" w:after="60" w:line="240" w:lineRule="auto"/>
-        <w:jc w:val="left"/>
-      </w:pPr>
-      <w:bookmarkStart w:id="531" w:name="_TocTbl31"/>
-      <w:r>
-        <w:rPr>
-          <w:rFonts w:ascii="Arial" w:hAnsi="Arial" w:eastAsia="Arial" w:cs="Arial"/>
-          <w:b w:val="1"/>
-          <w:bCs w:val="1"/>
-          <w:sz w:val="20"/>
-          <w:szCs w:val="20"/>
-          <w:lang w:val="es-ES"/>
-        </w:rPr>
-        <w:t xml:space="preserve">Tabla </w:t>
-      </w:r>
-      <w:r>
-        <w:fldChar w:fldCharType="begin"/>
-      </w:r>
-      <w:r>
-        <w:instrText xml:space="preserve"> SEQ Tabla \* ARABIC </w:instrText>
-      </w:r>
-      <w:r>
-        <w:fldChar w:fldCharType="separate"/>
-      </w:r>
-      <w:r>
-        <w:rPr>
-          <w:rFonts w:ascii="Arial" w:hAnsi="Arial" w:eastAsia="Arial" w:cs="Arial"/>
-          <w:b w:val="1"/>
-          <w:bCs w:val="1"/>
-          <w:sz w:val="20"/>
-          <w:szCs w:val="20"/>
-          <w:lang w:val="es-ES"/>
-        </w:rPr>
-        <w:t xml:space="preserve">31</w:t>
-      </w:r>
-      <w:r>
-        <w:fldChar w:fldCharType="end"/>
-      </w:r>
-      <w:r>
-        <w:rPr>
-          <w:rFonts w:ascii="Arial" w:hAnsi="Arial" w:eastAsia="Arial" w:cs="Arial"/>
-          <w:b w:val="1"/>
-          <w:bCs w:val="1"/>
-          <w:sz w:val="20"/>
-          <w:szCs w:val="20"/>
-          <w:lang w:val="es-ES"/>
-        </w:rPr>
-        <w:t xml:space="preserve">. Evidencia PT-SEG-001: contraseñas en la base de datos (PT-SEG-001_01_hash_politica.txt)</w:t>
-      </w:r>
-      <w:bookmarkEnd w:id="531"/>
-    </w:p>
-    <w:tbl>
-      <w:tblPr>
-        <w:tblW w:w="9746" w:type="dxa"/>
-        <w:tblBorders>
-          <w:top w:val="single" w:sz="6" w:space="0" w:color="000000"/>
-          <w:left w:val="single" w:sz="6" w:space="0" w:color="000000"/>
-          <w:bottom w:val="single" w:sz="6" w:space="0" w:color="000000"/>
-          <w:right w:val="single" w:sz="6" w:space="0" w:color="000000"/>
-          <w:insideH w:val="single" w:sz="4" w:space="0" w:color="808080"/>
-          <w:insideV w:val="single" w:sz="4" w:space="0" w:color="808080"/>
-        </w:tblBorders>
-        <w:tblLayout w:type="fixed"/>
-      </w:tblPr>
-      <w:tblGrid>
-        <w:gridCol w:w="9746"/>
-      </w:tblGrid>
-      <w:tr>
-        <w:tc>
-          <w:tcPr>
-            <w:tcW w:w="9746" w:type="dxa"/>
-            <w:shd w:val="clear" w:color="auto" w:fill="F2F2F2"/>
-            <w:tcMar>
-              <w:left w:w="120" w:type="dxa"/>
-              <w:right w:w="120" w:type="dxa"/>
-            </w:tcMar>
-          </w:tcPr>
-          <w:p>
-            <w:pPr>
-              <w:spacing w:before="0" w:after="0" w:line="240" w:lineRule="auto"/>
-              <w:jc w:val="left"/>
-            </w:pPr>
-            <w:r>
-              <w:rPr>
-                <w:rFonts w:ascii="Courier New" w:hAnsi="Courier New" w:cs="Courier New"/>
-                <w:sz w:val="16"/>
-                <w:szCs w:val="16"/>
-                <w:lang w:val="es-ES"/>
-              </w:rPr>
-              <w:t xml:space="preserve">[NO CUMPLE] La dependencia y las llamadas de hashing existen en el backend</w:t>
-            </w:r>
-          </w:p>
-          <w:p>
-            <w:pPr>
-              <w:spacing w:before="0" w:after="0" w:line="240" w:lineRule="auto"/>
-              <w:jc w:val="left"/>
-            </w:pPr>
-            <w:r>
-              <w:rPr>
-                <w:rFonts w:ascii="Courier New" w:hAnsi="Courier New" w:cs="Courier New"/>
-                <w:sz w:val="16"/>
-                <w:szCs w:val="16"/>
-                <w:lang w:val="es-ES"/>
-              </w:rPr>
-              <w:t xml:space="preserve">2) Base de datos: SELECT nombre_usuario, contrasena_hash FROM usuarios:</w:t>
-            </w:r>
-          </w:p>
-          <w:p>
-            <w:pPr>
-              <w:spacing w:before="0" w:after="0" w:line="240" w:lineRule="auto"/>
-              <w:jc w:val="left"/>
-            </w:pPr>
-            <w:r>
-              <w:rPr>
-                <w:rFonts w:ascii="Courier New" w:hAnsi="Courier New" w:cs="Courier New"/>
-                <w:sz w:val="16"/>
-                <w:szCs w:val="16"/>
-                <w:lang w:val="es-ES"/>
-              </w:rPr>
-              <w:t xml:space="preserve">admin|admin</w:t>
-            </w:r>
-          </w:p>
-          <w:p>
-            <w:pPr>
-              <w:spacing w:before="0" w:after="0" w:line="240" w:lineRule="auto"/>
-              <w:jc w:val="left"/>
-            </w:pPr>
-            <w:r>
-              <w:rPr>
-                <w:rFonts w:ascii="Courier New" w:hAnsi="Courier New" w:cs="Courier New"/>
-                <w:sz w:val="16"/>
-                <w:szCs w:val="16"/>
-                <w:lang w:val="es-ES"/>
-              </w:rPr>
-              <w:t xml:space="preserve">editor|editor</w:t>
-            </w:r>
-          </w:p>
-          <w:p>
-            <w:pPr>
-              <w:spacing w:before="0" w:after="0" w:line="240" w:lineRule="auto"/>
-              <w:jc w:val="left"/>
-            </w:pPr>
-            <w:r>
-              <w:rPr>
-                <w:rFonts w:ascii="Courier New" w:hAnsi="Courier New" w:cs="Courier New"/>
-                <w:sz w:val="16"/>
-                <w:szCs w:val="16"/>
-                <w:lang w:val="es-ES"/>
-              </w:rPr>
-              <w:t xml:space="preserve">[NO CUMPLE] 100 % de los registros tienen hash bcrypt ($2a$/$2b$/$2y$) — 0/6</w:t>
-            </w:r>
-          </w:p>
-          <w:p>
-            <w:pPr>
-              <w:spacing w:before="0" w:after="0" w:line="240" w:lineRule="auto"/>
-              <w:jc w:val="left"/>
-            </w:pPr>
-            <w:r>
-              <w:rPr>
-                <w:rFonts w:ascii="Courier New" w:hAnsi="Courier New" w:cs="Courier New"/>
-                <w:sz w:val="16"/>
-                <w:szCs w:val="16"/>
-                <w:lang w:val="es-ES"/>
-              </w:rPr>
-              <w:t xml:space="preserve">[NO CUMPLE] El backend rechaza las contraseñas que incumplen la política (≥ 12, mayúscula, minúscula, número y símbolo</w:t>
-            </w:r>
-          </w:p>
-          <w:p>
-            <w:pPr>
-              <w:spacing w:before="0" w:after="0" w:line="240" w:lineRule="auto"/>
-              <w:jc w:val="left"/>
-            </w:pPr>
-            <w:r>
-              <w:rPr>
-                <w:rFonts w:ascii="Courier New" w:hAnsi="Courier New" w:cs="Courier New"/>
-                <w:sz w:val="16"/>
-                <w:szCs w:val="16"/>
-                <w:lang w:val="es-ES"/>
-              </w:rPr>
-              <w:t xml:space="preserve">[NO CUMPLE] La contraseña almacenada no es legible (hash con sal) — valor en BD: Atlas#2026-Segura</w:t>
-            </w:r>
-          </w:p>
-          <w:p>
-            <w:pPr>
-              <w:spacing w:before="0" w:after="0" w:line="240" w:lineRule="auto"/>
-              <w:jc w:val="left"/>
-            </w:pPr>
-            <w:r>
-              <w:rPr>
-                <w:rFonts w:ascii="Courier New" w:hAnsi="Courier New" w:cs="Courier New"/>
-                <w:sz w:val="16"/>
-                <w:szCs w:val="16"/>
-                <w:lang w:val="es-ES"/>
-              </w:rPr>
-              <w:t xml:space="preserve">VEREDICTO: Fallido  (0/4 criterios cumplidos)</w:t>
-            </w:r>
-          </w:p>
-        </w:tc>
-      </w:tr>
-    </w:tbl>
-    <w:p>
-      <w:pPr>
-        <w:spacing w:before="0" w:after="120" w:line="240" w:lineRule="auto"/>
-      </w:pPr>
-    </w:p>
-    <w:p>
-      <w:pPr>
-        <w:keepNext/>
-        <w:spacing w:before="120" w:after="60" w:line="240" w:lineRule="auto"/>
-        <w:jc w:val="left"/>
-      </w:pPr>
-      <w:bookmarkStart w:id="532" w:name="_TocTbl32"/>
-      <w:r>
-        <w:rPr>
-          <w:rFonts w:ascii="Arial" w:hAnsi="Arial" w:eastAsia="Arial" w:cs="Arial"/>
-          <w:b w:val="1"/>
-          <w:bCs w:val="1"/>
-          <w:sz w:val="20"/>
-          <w:szCs w:val="20"/>
-          <w:lang w:val="es-ES"/>
-        </w:rPr>
-        <w:t xml:space="preserve">Tabla </w:t>
-      </w:r>
-      <w:r>
-        <w:fldChar w:fldCharType="begin"/>
-      </w:r>
-      <w:r>
-        <w:instrText xml:space="preserve"> SEQ Tabla \* ARABIC </w:instrText>
-      </w:r>
-      <w:r>
-        <w:fldChar w:fldCharType="separate"/>
-      </w:r>
-      <w:r>
-        <w:rPr>
-          <w:rFonts w:ascii="Arial" w:hAnsi="Arial" w:eastAsia="Arial" w:cs="Arial"/>
-          <w:b w:val="1"/>
-          <w:bCs w:val="1"/>
-          <w:sz w:val="20"/>
-          <w:szCs w:val="20"/>
-          <w:lang w:val="es-ES"/>
-        </w:rPr>
-        <w:t xml:space="preserve">32</w:t>
-      </w:r>
-      <w:r>
-        <w:fldChar w:fldCharType="end"/>
-      </w:r>
-      <w:r>
-        <w:rPr>
-          <w:rFonts w:ascii="Arial" w:hAnsi="Arial" w:eastAsia="Arial" w:cs="Arial"/>
-          <w:b w:val="1"/>
-          <w:bCs w:val="1"/>
-          <w:sz w:val="20"/>
-          <w:szCs w:val="20"/>
-          <w:lang w:val="es-ES"/>
-        </w:rPr>
-        <w:t xml:space="preserve">. Evidencia PT-SEG-002: operaciones del editor (PT-SEG-002_01_rbac.txt)</w:t>
-      </w:r>
-      <w:bookmarkEnd w:id="532"/>
-    </w:p>
-    <w:tbl>
-      <w:tblPr>
-        <w:tblW w:w="9746" w:type="dxa"/>
-        <w:tblBorders>
-          <w:top w:val="single" w:sz="6" w:space="0" w:color="000000"/>
-          <w:left w:val="single" w:sz="6" w:space="0" w:color="000000"/>
-          <w:bottom w:val="single" w:sz="6" w:space="0" w:color="000000"/>
-          <w:right w:val="single" w:sz="6" w:space="0" w:color="000000"/>
-          <w:insideH w:val="single" w:sz="4" w:space="0" w:color="808080"/>
-          <w:insideV w:val="single" w:sz="4" w:space="0" w:color="808080"/>
-        </w:tblBorders>
-        <w:tblLayout w:type="fixed"/>
-      </w:tblPr>
-      <w:tblGrid>
-        <w:gridCol w:w="9746"/>
-      </w:tblGrid>
-      <w:tr>
-        <w:tc>
-          <w:tcPr>
-            <w:tcW w:w="9746" w:type="dxa"/>
-            <w:shd w:val="clear" w:color="auto" w:fill="F2F2F2"/>
-            <w:tcMar>
-              <w:left w:w="120" w:type="dxa"/>
-              <w:right w:w="120" w:type="dxa"/>
-            </w:tcMar>
-          </w:tcPr>
-          <w:p>
-            <w:pPr>
-              <w:spacing w:before="0" w:after="0" w:line="240" w:lineRule="auto"/>
-              <w:jc w:val="left"/>
-            </w:pPr>
-            <w:r>
-              <w:rPr>
-                <w:rFonts w:ascii="Courier New" w:hAnsi="Courier New" w:cs="Courier New"/>
-                <w:sz w:val="16"/>
-                <w:szCs w:val="16"/>
-                <w:lang w:val="es-ES"/>
-              </w:rPr>
-              <w:t xml:space="preserve">1) Payload JWT editor: {"usuarioId": "2", "nombreUsuario": "editor", "empresaUsuarioId": "2", "empresaId": "1", "iat":</w:t>
-            </w:r>
-          </w:p>
-          <w:p>
-            <w:pPr>
-              <w:spacing w:before="0" w:after="0" w:line="240" w:lineRule="auto"/>
-              <w:jc w:val="left"/>
-            </w:pPr>
-            <w:r>
-              <w:rPr>
-                <w:rFonts w:ascii="Courier New" w:hAnsi="Courier New" w:cs="Courier New"/>
-                <w:sz w:val="16"/>
-                <w:szCs w:val="16"/>
-                <w:lang w:val="es-ES"/>
-              </w:rPr>
-              <w:t xml:space="preserve">[NO CUMPLE] El token incluye el rol del usuario — campos: ['usuarioId', 'nombreUsuario', 'empresaUsuarioId', 'empresaI</w:t>
-            </w:r>
-          </w:p>
-          <w:p>
-            <w:pPr>
-              <w:spacing w:before="0" w:after="0" w:line="240" w:lineRule="auto"/>
-              <w:jc w:val="left"/>
-            </w:pPr>
-            <w:r>
-              <w:rPr>
-                <w:rFonts w:ascii="Courier New" w:hAnsi="Courier New" w:cs="Courier New"/>
-                <w:sz w:val="16"/>
-                <w:szCs w:val="16"/>
-                <w:lang w:val="es-ES"/>
-              </w:rPr>
-              <w:t xml:space="preserve">POST /clientes -&gt; HTTP 201 (6 ms) [escritura] {"id":"15","nombre":"Editor crea 1793286817","correo":"edit_1793286817</w:t>
-            </w:r>
-          </w:p>
-          <w:p>
-            <w:pPr>
-              <w:spacing w:before="0" w:after="0" w:line="240" w:lineRule="auto"/>
-              <w:jc w:val="left"/>
-            </w:pPr>
-            <w:r>
-              <w:rPr>
-                <w:rFonts w:ascii="Courier New" w:hAnsi="Courier New" w:cs="Courier New"/>
-                <w:sz w:val="16"/>
-                <w:szCs w:val="16"/>
-                <w:lang w:val="es-ES"/>
-              </w:rPr>
-              <w:t xml:space="preserve">PUT /clientes/14 -&gt; HTTP 200 (4 ms) [escritura] {"id":"14","nombre":"Editor edita 1793286817","correo":"rbac_179328681</w:t>
-            </w:r>
-          </w:p>
-          <w:p>
-            <w:pPr>
-              <w:spacing w:before="0" w:after="0" w:line="240" w:lineRule="auto"/>
-              <w:jc w:val="left"/>
-            </w:pPr>
-            <w:r>
-              <w:rPr>
-                <w:rFonts w:ascii="Courier New" w:hAnsi="Courier New" w:cs="Courier New"/>
-                <w:sz w:val="16"/>
-                <w:szCs w:val="16"/>
-                <w:lang w:val="es-ES"/>
-              </w:rPr>
-              <w:t xml:space="preserve">DELETE /clientes/14 -&gt; HTTP 500 (3 ms) [escritura] {"error":"Error al eliminar cliente","glosa":"update or delete on t</w:t>
-            </w:r>
-          </w:p>
-          <w:p>
-            <w:pPr>
-              <w:spacing w:before="0" w:after="0" w:line="240" w:lineRule="auto"/>
-              <w:jc w:val="left"/>
-            </w:pPr>
-            <w:r>
-              <w:rPr>
-                <w:rFonts w:ascii="Courier New" w:hAnsi="Courier New" w:cs="Courier New"/>
-                <w:sz w:val="16"/>
-                <w:szCs w:val="16"/>
-                <w:lang w:val="es-ES"/>
-              </w:rPr>
-              <w:t xml:space="preserve">POST /contratos -&gt; HTTP 201 (10 ms) [escritura] {"id":"13","cliente_id":"14","titulo":"Editor K 1793286817","descripci</w:t>
-            </w:r>
-          </w:p>
-          <w:p>
-            <w:pPr>
-              <w:spacing w:before="0" w:after="0" w:line="240" w:lineRule="auto"/>
-              <w:jc w:val="left"/>
-            </w:pPr>
-            <w:r>
-              <w:rPr>
-                <w:rFonts w:ascii="Courier New" w:hAnsi="Courier New" w:cs="Courier New"/>
-                <w:sz w:val="16"/>
-                <w:szCs w:val="16"/>
-                <w:lang w:val="es-ES"/>
-              </w:rPr>
-              <w:t xml:space="preserve">DELETE /contratos/12 -&gt; HTTP 200 (2 ms) [escritura] {"deleted":true}</w:t>
-            </w:r>
-          </w:p>
-          <w:p>
-            <w:pPr>
-              <w:spacing w:before="0" w:after="0" w:line="240" w:lineRule="auto"/>
-              <w:jc w:val="left"/>
-            </w:pPr>
-            <w:r>
-              <w:rPr>
-                <w:rFonts w:ascii="Courier New" w:hAnsi="Courier New" w:cs="Courier New"/>
-                <w:sz w:val="16"/>
-                <w:szCs w:val="16"/>
-                <w:lang w:val="es-ES"/>
-              </w:rPr>
-              <w:t xml:space="preserve">POST /empresa-usuarios -&gt; HTTP 201 (3 ms) [escritura] {"id":"7","empresa_id":"1","usuario_id":"13","rol_id":"1","creat</w:t>
-            </w:r>
-          </w:p>
-          <w:p>
-            <w:pPr>
-              <w:spacing w:before="0" w:after="0" w:line="240" w:lineRule="auto"/>
-              <w:jc w:val="left"/>
-            </w:pPr>
-            <w:r>
-              <w:rPr>
-                <w:rFonts w:ascii="Courier New" w:hAnsi="Courier New" w:cs="Courier New"/>
-                <w:sz w:val="16"/>
-                <w:szCs w:val="16"/>
-                <w:lang w:val="es-ES"/>
-              </w:rPr>
-              <w:t xml:space="preserve">DELETE /usuarios/12 -&gt; HTTP 200 (2 ms) [escritura] {"deleted":true}</w:t>
-            </w:r>
-          </w:p>
-          <w:p>
-            <w:pPr>
-              <w:spacing w:before="0" w:after="0" w:line="240" w:lineRule="auto"/>
-              <w:jc w:val="left"/>
-            </w:pPr>
-            <w:r>
-              <w:rPr>
-                <w:rFonts w:ascii="Courier New" w:hAnsi="Courier New" w:cs="Courier New"/>
-                <w:sz w:val="16"/>
-                <w:szCs w:val="16"/>
-                <w:lang w:val="es-ES"/>
-              </w:rPr>
-              <w:t xml:space="preserve">[NO CUMPLE] 0 operaciones de escritura exitosas con rol editor — 6/7 escrituras exitosas</w:t>
-            </w:r>
-          </w:p>
-          <w:p>
-            <w:pPr>
-              <w:spacing w:before="0" w:after="0" w:line="240" w:lineRule="auto"/>
-              <w:jc w:val="left"/>
-            </w:pPr>
-            <w:r>
-              <w:rPr>
-                <w:rFonts w:ascii="Courier New" w:hAnsi="Courier New" w:cs="Courier New"/>
-                <w:sz w:val="16"/>
-                <w:szCs w:val="16"/>
-                <w:lang w:val="es-ES"/>
-              </w:rPr>
-              <w:t xml:space="preserve">[NO CUMPLE] Las escrituras del editor se deniegan con 403 — códigos obtenidos: [201, 200, 500, 201, 200, 201, 200]</w:t>
-            </w:r>
-          </w:p>
-          <w:p>
-            <w:pPr>
-              <w:spacing w:before="0" w:after="0" w:line="240" w:lineRule="auto"/>
-              <w:jc w:val="left"/>
-            </w:pPr>
-            <w:r>
-              <w:rPr>
-                <w:rFonts w:ascii="Courier New" w:hAnsi="Courier New" w:cs="Courier New"/>
-                <w:sz w:val="16"/>
-                <w:szCs w:val="16"/>
-                <w:lang w:val="es-ES"/>
-              </w:rPr>
-              <w:t xml:space="preserve">VEREDICTO: Fallido  (1/4 criterios cumplidos)</w:t>
-            </w:r>
-          </w:p>
-        </w:tc>
-      </w:tr>
-    </w:tbl>
-    <w:p>
-      <w:pPr>
-        <w:spacing w:before="0" w:after="120" w:line="240" w:lineRule="auto"/>
-      </w:pPr>
-    </w:p>
-    <w:p>
-      <w:pPr>
-        <w:keepNext/>
-        <w:spacing w:before="120" w:after="60" w:line="240" w:lineRule="auto"/>
-        <w:jc w:val="left"/>
-      </w:pPr>
-      <w:bookmarkStart w:id="533" w:name="_TocTbl33"/>
-      <w:r>
-        <w:rPr>
-          <w:rFonts w:ascii="Arial" w:hAnsi="Arial" w:eastAsia="Arial" w:cs="Arial"/>
-          <w:b w:val="1"/>
-          <w:bCs w:val="1"/>
-          <w:sz w:val="20"/>
-          <w:szCs w:val="20"/>
-          <w:lang w:val="es-ES"/>
-        </w:rPr>
-        <w:t xml:space="preserve">Tabla </w:t>
-      </w:r>
-      <w:r>
-        <w:fldChar w:fldCharType="begin"/>
-      </w:r>
-      <w:r>
-        <w:instrText xml:space="preserve"> SEQ Tabla \* ARABIC </w:instrText>
-      </w:r>
-      <w:r>
-        <w:fldChar w:fldCharType="separate"/>
-      </w:r>
-      <w:r>
-        <w:rPr>
-          <w:rFonts w:ascii="Arial" w:hAnsi="Arial" w:eastAsia="Arial" w:cs="Arial"/>
-          <w:b w:val="1"/>
-          <w:bCs w:val="1"/>
-          <w:sz w:val="20"/>
-          <w:szCs w:val="20"/>
-          <w:lang w:val="es-ES"/>
-        </w:rPr>
-        <w:t xml:space="preserve">33</w:t>
-      </w:r>
-      <w:r>
-        <w:fldChar w:fldCharType="end"/>
-      </w:r>
-      <w:r>
-        <w:rPr>
-          <w:rFonts w:ascii="Arial" w:hAnsi="Arial" w:eastAsia="Arial" w:cs="Arial"/>
-          <w:b w:val="1"/>
-          <w:bCs w:val="1"/>
-          <w:sz w:val="20"/>
-          <w:szCs w:val="20"/>
-          <w:lang w:val="es-ES"/>
-        </w:rPr>
-        <w:t xml:space="preserve">. Evidencia PT-SEG-009: acceso a recursos de otra empresa y sin token (PT-SEG-009_01_aislamiento.txt)</w:t>
-      </w:r>
-      <w:bookmarkEnd w:id="533"/>
-    </w:p>
-    <w:tbl>
-      <w:tblPr>
-        <w:tblW w:w="9746" w:type="dxa"/>
-        <w:tblBorders>
-          <w:top w:val="single" w:sz="6" w:space="0" w:color="000000"/>
-          <w:left w:val="single" w:sz="6" w:space="0" w:color="000000"/>
-          <w:bottom w:val="single" w:sz="6" w:space="0" w:color="000000"/>
-          <w:right w:val="single" w:sz="6" w:space="0" w:color="000000"/>
-          <w:insideH w:val="single" w:sz="4" w:space="0" w:color="808080"/>
-          <w:insideV w:val="single" w:sz="4" w:space="0" w:color="808080"/>
-        </w:tblBorders>
-        <w:tblLayout w:type="fixed"/>
-      </w:tblPr>
-      <w:tblGrid>
-        <w:gridCol w:w="9746"/>
-      </w:tblGrid>
-      <w:tr>
-        <w:tc>
-          <w:tcPr>
-            <w:tcW w:w="9746" w:type="dxa"/>
-            <w:shd w:val="clear" w:color="auto" w:fill="F2F2F2"/>
-            <w:tcMar>
-              <w:left w:w="120" w:type="dxa"/>
-              <w:right w:w="120" w:type="dxa"/>
-            </w:tcMar>
-          </w:tcPr>
-          <w:p>
-            <w:pPr>
-              <w:spacing w:before="0" w:after="0" w:line="240" w:lineRule="auto"/>
-              <w:jc w:val="left"/>
-            </w:pPr>
-            <w:r>
-              <w:rPr>
-                <w:rFonts w:ascii="Courier New" w:hAnsi="Courier New" w:cs="Courier New"/>
-                <w:sz w:val="16"/>
-                <w:szCs w:val="16"/>
-                <w:lang w:val="es-ES"/>
-              </w:rPr>
-              <w:t xml:space="preserve">GET /clientes/11387 -&gt; HTTP 404 (2 ms) [empresa B] '{"error":"No encontrado"}'</w:t>
-            </w:r>
-          </w:p>
-          <w:p>
-            <w:pPr>
-              <w:spacing w:before="0" w:after="0" w:line="240" w:lineRule="auto"/>
-              <w:jc w:val="left"/>
-            </w:pPr>
-            <w:r>
-              <w:rPr>
-                <w:rFonts w:ascii="Courier New" w:hAnsi="Courier New" w:cs="Courier New"/>
-                <w:sz w:val="16"/>
-                <w:szCs w:val="16"/>
-                <w:lang w:val="es-ES"/>
-              </w:rPr>
-              <w:t xml:space="preserve">GET /contratos/37 -&gt; HTTP 200 (1 ms) [empresa B] ACCESIBLE '{"id":"37","cliente_id":"11387","titulo":"Contrato base","</w:t>
-            </w:r>
-          </w:p>
-          <w:p>
-            <w:pPr>
-              <w:spacing w:before="0" w:after="0" w:line="240" w:lineRule="auto"/>
-              <w:jc w:val="left"/>
-            </w:pPr>
-            <w:r>
-              <w:rPr>
-                <w:rFonts w:ascii="Courier New" w:hAnsi="Courier New" w:cs="Courier New"/>
-                <w:sz w:val="16"/>
-                <w:szCs w:val="16"/>
-                <w:lang w:val="es-ES"/>
-              </w:rPr>
-              <w:t xml:space="preserve">GET /contratos/37/file -&gt; HTTP 200 (2 ms) [empresa B] ACCESIBLE '%PDF-1.4\n�����A\x14��.��N���\x19\x7f�/\tq"i�\x06K�堉�</w:t>
-            </w:r>
-          </w:p>
-          <w:p>
-            <w:pPr>
-              <w:spacing w:before="0" w:after="0" w:line="240" w:lineRule="auto"/>
-              <w:jc w:val="left"/>
-            </w:pPr>
-            <w:r>
-              <w:rPr>
-                <w:rFonts w:ascii="Courier New" w:hAnsi="Courier New" w:cs="Courier New"/>
-                <w:sz w:val="16"/>
-                <w:szCs w:val="16"/>
-                <w:lang w:val="es-ES"/>
-              </w:rPr>
-              <w:t xml:space="preserve">PUT /clientes/11387 -&gt; HTTP 404 (1 ms) [empresa B] '{"error":"No encontrado"}'</w:t>
-            </w:r>
-          </w:p>
-          <w:p>
-            <w:pPr>
-              <w:spacing w:before="0" w:after="0" w:line="240" w:lineRule="auto"/>
-              <w:jc w:val="left"/>
-            </w:pPr>
-            <w:r>
-              <w:rPr>
-                <w:rFonts w:ascii="Courier New" w:hAnsi="Courier New" w:cs="Courier New"/>
-                <w:sz w:val="16"/>
-                <w:szCs w:val="16"/>
-                <w:lang w:val="es-ES"/>
-              </w:rPr>
-              <w:t xml:space="preserve">GET /auditoria -&gt; HTTP 200 (89 ms) [empresa B] ACCESIBLE '[{"id":"23367","usuario_id":"admin","accion":"CONTRATOS_CREA</w:t>
-            </w:r>
-          </w:p>
-          <w:p>
-            <w:pPr>
-              <w:spacing w:before="0" w:after="0" w:line="240" w:lineRule="auto"/>
-              <w:jc w:val="left"/>
-            </w:pPr>
-            <w:r>
-              <w:rPr>
-                <w:rFonts w:ascii="Courier New" w:hAnsi="Courier New" w:cs="Courier New"/>
-                <w:sz w:val="16"/>
-                <w:szCs w:val="16"/>
-                <w:lang w:val="es-ES"/>
-              </w:rPr>
-              <w:t xml:space="preserve">GET /contratos/37/file -&gt; HTTP 200 (2 ms) [sin token] ACCESIBLE '%PDF-1.4\n�����A\x14��.��N���\x19\x7f�/\tq"i�\x06K�堉�</w:t>
-            </w:r>
-          </w:p>
-          <w:p>
-            <w:pPr>
-              <w:spacing w:before="0" w:after="0" w:line="240" w:lineRule="auto"/>
-              <w:jc w:val="left"/>
-            </w:pPr>
-            <w:r>
-              <w:rPr>
-                <w:rFonts w:ascii="Courier New" w:hAnsi="Courier New" w:cs="Courier New"/>
-                <w:sz w:val="16"/>
-                <w:szCs w:val="16"/>
-                <w:lang w:val="es-ES"/>
-              </w:rPr>
-              <w:t xml:space="preserve">GET /contratos/37 -&gt; HTTP 200 (1 ms) [sin token] ACCESIBLE '{"id":"37","cliente_id":"11387","titulo":"Contrato base","</w:t>
-            </w:r>
-          </w:p>
-          <w:p>
-            <w:pPr>
-              <w:spacing w:before="0" w:after="0" w:line="240" w:lineRule="auto"/>
-              <w:jc w:val="left"/>
-            </w:pPr>
-            <w:r>
-              <w:rPr>
-                <w:rFonts w:ascii="Courier New" w:hAnsi="Courier New" w:cs="Courier New"/>
-                <w:sz w:val="16"/>
-                <w:szCs w:val="16"/>
-                <w:lang w:val="es-ES"/>
-              </w:rPr>
-              <w:t xml:space="preserve">POST /contratos -&gt; HTTP 201 (4 ms) [empresa B] ACCESIBLE '{"id":"38","cliente_id":"11387","titulo":"Contrato intruso 1</w:t>
-            </w:r>
-          </w:p>
-          <w:p>
-            <w:pPr>
-              <w:spacing w:before="0" w:after="0" w:line="240" w:lineRule="auto"/>
-              <w:jc w:val="left"/>
-            </w:pPr>
-            <w:r>
-              <w:rPr>
-                <w:rFonts w:ascii="Courier New" w:hAnsi="Courier New" w:cs="Courier New"/>
-                <w:sz w:val="16"/>
-                <w:szCs w:val="16"/>
-                <w:lang w:val="es-ES"/>
-              </w:rPr>
-              <w:t xml:space="preserve">POST /contratos -&gt; HTTP 500 (2 ms) [sin token] '{"error":"Error al crear contrato","glosa":"null value in co'</w:t>
-            </w:r>
-          </w:p>
-          <w:p>
-            <w:pPr>
-              <w:spacing w:before="0" w:after="0" w:line="240" w:lineRule="auto"/>
-              <w:jc w:val="left"/>
-            </w:pPr>
-            <w:r>
-              <w:rPr>
-                <w:rFonts w:ascii="Courier New" w:hAnsi="Courier New" w:cs="Courier New"/>
-                <w:sz w:val="16"/>
-                <w:szCs w:val="16"/>
-                <w:lang w:val="es-ES"/>
-              </w:rPr>
-              <w:t xml:space="preserve">[NO CUMPLE] 0 recursos de otra empresa accesibles o modificables — 6/9 accesos permitidos</w:t>
-            </w:r>
-          </w:p>
-          <w:p>
-            <w:pPr>
-              <w:spacing w:before="0" w:after="0" w:line="240" w:lineRule="auto"/>
-              <w:jc w:val="left"/>
-            </w:pPr>
-            <w:r>
-              <w:rPr>
-                <w:rFonts w:ascii="Courier New" w:hAnsi="Courier New" w:cs="Courier New"/>
-                <w:sz w:val="16"/>
-                <w:szCs w:val="16"/>
-                <w:lang w:val="es-ES"/>
-              </w:rPr>
-              <w:t xml:space="preserve">VEREDICTO: Fallido  (0/1 criterios cumplidos)</w:t>
-            </w:r>
-          </w:p>
-        </w:tc>
-      </w:tr>
-    </w:tbl>
-    <w:p>
-      <w:pPr>
-        <w:spacing w:before="0" w:after="120" w:line="240" w:lineRule="auto"/>
-      </w:pPr>
-    </w:p>
-    <w:p>
-      <w:pPr>
-        <w:keepNext/>
-        <w:spacing w:before="120" w:after="60" w:line="240" w:lineRule="auto"/>
-        <w:jc w:val="left"/>
-      </w:pPr>
-      <w:bookmarkStart w:id="534" w:name="_TocTbl34"/>
-      <w:r>
-        <w:rPr>
-          <w:rFonts w:ascii="Arial" w:hAnsi="Arial" w:eastAsia="Arial" w:cs="Arial"/>
-          <w:b w:val="1"/>
-          <w:bCs w:val="1"/>
-          <w:sz w:val="20"/>
-          <w:szCs w:val="20"/>
-          <w:lang w:val="es-ES"/>
-        </w:rPr>
-        <w:t xml:space="preserve">Tabla </w:t>
-      </w:r>
-      <w:r>
-        <w:fldChar w:fldCharType="begin"/>
-      </w:r>
-      <w:r>
-        <w:instrText xml:space="preserve"> SEQ Tabla \* ARABIC </w:instrText>
-      </w:r>
-      <w:r>
-        <w:fldChar w:fldCharType="separate"/>
-      </w:r>
-      <w:r>
-        <w:rPr>
-          <w:rFonts w:ascii="Arial" w:hAnsi="Arial" w:eastAsia="Arial" w:cs="Arial"/>
-          <w:b w:val="1"/>
-          <w:bCs w:val="1"/>
-          <w:sz w:val="20"/>
-          <w:szCs w:val="20"/>
-          <w:lang w:val="es-ES"/>
-        </w:rPr>
-        <w:t xml:space="preserve">34</w:t>
-      </w:r>
-      <w:r>
-        <w:fldChar w:fldCharType="end"/>
-      </w:r>
-      <w:r>
-        <w:rPr>
-          <w:rFonts w:ascii="Arial" w:hAnsi="Arial" w:eastAsia="Arial" w:cs="Arial"/>
-          <w:b w:val="1"/>
-          <w:bCs w:val="1"/>
-          <w:sz w:val="20"/>
-          <w:szCs w:val="20"/>
-          <w:lang w:val="es-ES"/>
-        </w:rPr>
-        <w:t xml:space="preserve">. Evidencia PT-SEG-008: token forjado con el secreto por defecto (PT-SEG-008_01_jwt.txt)</w:t>
-      </w:r>
-      <w:bookmarkEnd w:id="534"/>
-    </w:p>
-    <w:tbl>
-      <w:tblPr>
-        <w:tblW w:w="9746" w:type="dxa"/>
-        <w:tblBorders>
-          <w:top w:val="single" w:sz="6" w:space="0" w:color="000000"/>
-          <w:left w:val="single" w:sz="6" w:space="0" w:color="000000"/>
-          <w:bottom w:val="single" w:sz="6" w:space="0" w:color="000000"/>
-          <w:right w:val="single" w:sz="6" w:space="0" w:color="000000"/>
-          <w:insideH w:val="single" w:sz="4" w:space="0" w:color="808080"/>
-          <w:insideV w:val="single" w:sz="4" w:space="0" w:color="808080"/>
-        </w:tblBorders>
-        <w:tblLayout w:type="fixed"/>
-      </w:tblPr>
-      <w:tblGrid>
-        <w:gridCol w:w="9746"/>
-      </w:tblGrid>
-      <w:tr>
-        <w:tc>
-          <w:tcPr>
-            <w:tcW w:w="9746" w:type="dxa"/>
-            <w:shd w:val="clear" w:color="auto" w:fill="F2F2F2"/>
-            <w:tcMar>
-              <w:left w:w="120" w:type="dxa"/>
-              <w:right w:w="120" w:type="dxa"/>
-            </w:tcMar>
-          </w:tcPr>
-          <w:p>
-            <w:pPr>
-              <w:spacing w:before="0" w:after="0" w:line="240" w:lineRule="auto"/>
-              <w:jc w:val="left"/>
-            </w:pPr>
-            <w:r>
-              <w:rPr>
-                <w:rFonts w:ascii="Courier New" w:hAnsi="Courier New" w:cs="Courier New"/>
-                <w:sz w:val="16"/>
-                <w:szCs w:val="16"/>
-                <w:lang w:val="es-ES"/>
-              </w:rPr>
-              <w:t xml:space="preserve">1) JWT_SECRET efectivo en el contenedor del backend: "your-secret-key-change-in-production"</w:t>
-            </w:r>
-          </w:p>
-          <w:p>
-            <w:pPr>
-              <w:spacing w:before="0" w:after="0" w:line="240" w:lineRule="auto"/>
-              <w:jc w:val="left"/>
-            </w:pPr>
-            <w:r>
-              <w:rPr>
-                <w:rFonts w:ascii="Courier New" w:hAnsi="Courier New" w:cs="Courier New"/>
-                <w:sz w:val="16"/>
-                <w:szCs w:val="16"/>
-                <w:lang w:val="es-ES"/>
-              </w:rPr>
-              <w:t xml:space="preserve">[NO CUMPLE] El secreto JWT es robusto y no es un valor por defecto público — valor: your-secret-key-change-in-producti</w:t>
-            </w:r>
-          </w:p>
-          <w:p>
-            <w:pPr>
-              <w:spacing w:before="0" w:after="0" w:line="240" w:lineRule="auto"/>
-              <w:jc w:val="left"/>
-            </w:pPr>
-            <w:r>
-              <w:rPr>
-                <w:rFonts w:ascii="Courier New" w:hAnsi="Courier New" w:cs="Courier New"/>
-                <w:sz w:val="16"/>
-                <w:szCs w:val="16"/>
-                <w:lang w:val="es-ES"/>
-              </w:rPr>
-              <w:t xml:space="preserve">GET /clientes -&gt; HTTP 200 (4007 ms) (token forjado con el secreto por defecto del docker-compose)</w:t>
-            </w:r>
-          </w:p>
-          <w:p>
-            <w:pPr>
-              <w:spacing w:before="0" w:after="0" w:line="240" w:lineRule="auto"/>
-              <w:jc w:val="left"/>
-            </w:pPr>
-            <w:r>
-              <w:rPr>
-                <w:rFonts w:ascii="Courier New" w:hAnsi="Courier New" w:cs="Courier New"/>
-                <w:sz w:val="16"/>
-                <w:szCs w:val="16"/>
-                <w:lang w:val="es-ES"/>
-              </w:rPr>
-              <w:t xml:space="preserve">[NO CUMPLE] Un token firmado con el secreto por defecto es rechazado — HTTP 200</w:t>
-            </w:r>
-          </w:p>
-          <w:p>
-            <w:pPr>
-              <w:spacing w:before="0" w:after="0" w:line="240" w:lineRule="auto"/>
-              <w:jc w:val="left"/>
-            </w:pPr>
-            <w:r>
-              <w:rPr>
-                <w:rFonts w:ascii="Courier New" w:hAnsi="Courier New" w:cs="Courier New"/>
-                <w:sz w:val="16"/>
-                <w:szCs w:val="16"/>
-                <w:lang w:val="es-ES"/>
-              </w:rPr>
-              <w:t xml:space="preserve">VEREDICTO: Fallido  (4/6 criterios cumplidos)</w:t>
-            </w:r>
-          </w:p>
-        </w:tc>
-      </w:tr>
-    </w:tbl>
-    <w:p>
-      <w:pPr>
-        <w:spacing w:before="0" w:after="120" w:line="240" w:lineRule="auto"/>
-      </w:pPr>
-    </w:p>
-    <w:p>
-      <w:pPr>
-        <w:keepNext/>
-        <w:spacing w:before="120" w:after="60" w:line="240" w:lineRule="auto"/>
-        <w:jc w:val="left"/>
-      </w:pPr>
-      <w:bookmarkStart w:id="535" w:name="_TocTbl35"/>
-      <w:r>
-        <w:rPr>
-          <w:rFonts w:ascii="Arial" w:hAnsi="Arial" w:eastAsia="Arial" w:cs="Arial"/>
-          <w:b w:val="1"/>
-          <w:bCs w:val="1"/>
-          <w:sz w:val="20"/>
-          <w:szCs w:val="20"/>
-          <w:lang w:val="es-ES"/>
-        </w:rPr>
-        <w:t xml:space="preserve">Tabla </w:t>
-      </w:r>
-      <w:r>
-        <w:fldChar w:fldCharType="begin"/>
-      </w:r>
-      <w:r>
-        <w:instrText xml:space="preserve"> SEQ Tabla \* ARABIC </w:instrText>
-      </w:r>
-      <w:r>
-        <w:fldChar w:fldCharType="separate"/>
-      </w:r>
-      <w:r>
-        <w:rPr>
-          <w:rFonts w:ascii="Arial" w:hAnsi="Arial" w:eastAsia="Arial" w:cs="Arial"/>
-          <w:b w:val="1"/>
-          <w:bCs w:val="1"/>
-          <w:sz w:val="20"/>
-          <w:szCs w:val="20"/>
-          <w:lang w:val="es-ES"/>
-        </w:rPr>
-        <w:t xml:space="preserve">35</w:t>
-      </w:r>
-      <w:r>
-        <w:fldChar w:fldCharType="end"/>
-      </w:r>
-      <w:r>
-        <w:rPr>
-          <w:rFonts w:ascii="Arial" w:hAnsi="Arial" w:eastAsia="Arial" w:cs="Arial"/>
-          <w:b w:val="1"/>
-          <w:bCs w:val="1"/>
-          <w:sz w:val="20"/>
-          <w:szCs w:val="20"/>
-          <w:lang w:val="es-ES"/>
-        </w:rPr>
-        <w:t xml:space="preserve">. Evidencia PT-PERF-001: latencia por endpoint con k6 (PT-PERF-001_01_k6.txt)</w:t>
-      </w:r>
-      <w:bookmarkEnd w:id="535"/>
-    </w:p>
-    <w:tbl>
-      <w:tblPr>
-        <w:tblW w:w="9746" w:type="dxa"/>
-        <w:tblBorders>
-          <w:top w:val="single" w:sz="6" w:space="0" w:color="000000"/>
-          <w:left w:val="single" w:sz="6" w:space="0" w:color="000000"/>
-          <w:bottom w:val="single" w:sz="6" w:space="0" w:color="000000"/>
-          <w:right w:val="single" w:sz="6" w:space="0" w:color="000000"/>
-          <w:insideH w:val="single" w:sz="4" w:space="0" w:color="808080"/>
-          <w:insideV w:val="single" w:sz="4" w:space="0" w:color="808080"/>
-        </w:tblBorders>
-        <w:tblLayout w:type="fixed"/>
-      </w:tblPr>
-      <w:tblGrid>
-        <w:gridCol w:w="9746"/>
-      </w:tblGrid>
-      <w:tr>
-        <w:tc>
-          <w:tcPr>
-            <w:tcW w:w="9746" w:type="dxa"/>
-            <w:shd w:val="clear" w:color="auto" w:fill="F2F2F2"/>
-            <w:tcMar>
-              <w:left w:w="120" w:type="dxa"/>
-              <w:right w:w="120" w:type="dxa"/>
-            </w:tcMar>
-          </w:tcPr>
-          <w:p>
-            <w:pPr>
-              <w:spacing w:before="0" w:after="0" w:line="240" w:lineRule="auto"/>
-              <w:jc w:val="left"/>
-            </w:pPr>
-            <w:r>
-              <w:rPr>
-                <w:rFonts w:ascii="Courier New" w:hAnsi="Courier New" w:cs="Courier New"/>
-                <w:sz w:val="16"/>
-                <w:szCs w:val="16"/>
-                <w:lang w:val="es-ES"/>
-              </w:rPr>
-              <w:t xml:space="preserve">RESUMEN POR ENDPOINT (p95 frente al umbral de 300 ms):</w:t>
-            </w:r>
-          </w:p>
-          <w:p>
-            <w:pPr>
-              <w:spacing w:before="0" w:after="0" w:line="240" w:lineRule="auto"/>
-              <w:jc w:val="left"/>
-            </w:pPr>
-            <w:r>
-              <w:rPr>
-                <w:rFonts w:ascii="Courier New" w:hAnsi="Courier New" w:cs="Courier New"/>
-                <w:sz w:val="16"/>
-                <w:szCs w:val="16"/>
-                <w:lang w:val="es-ES"/>
-              </w:rPr>
-              <w:t xml:space="preserve">GET /clientes                p95 =   4024.8 ms   avg =   4008.9 ms   max =   4087.4 ms</w:t>
-            </w:r>
-          </w:p>
-          <w:p>
-            <w:pPr>
-              <w:spacing w:before="0" w:after="0" w:line="240" w:lineRule="auto"/>
-              <w:jc w:val="left"/>
-            </w:pPr>
-            <w:r>
-              <w:rPr>
-                <w:rFonts w:ascii="Courier New" w:hAnsi="Courier New" w:cs="Courier New"/>
-                <w:sz w:val="16"/>
-                <w:szCs w:val="16"/>
-                <w:lang w:val="es-ES"/>
-              </w:rPr>
-              <w:t xml:space="preserve">POST /clientes               p95 =     30.8 ms   avg =     11.5 ms   max =     69.9 ms</w:t>
-            </w:r>
-          </w:p>
-          <w:p>
-            <w:pPr>
-              <w:spacing w:before="0" w:after="0" w:line="240" w:lineRule="auto"/>
-              <w:jc w:val="left"/>
-            </w:pPr>
-            <w:r>
-              <w:rPr>
-                <w:rFonts w:ascii="Courier New" w:hAnsi="Courier New" w:cs="Courier New"/>
-                <w:sz w:val="16"/>
-                <w:szCs w:val="16"/>
-                <w:lang w:val="es-ES"/>
-              </w:rPr>
-              <w:t xml:space="preserve">PUT /clientes                p95 =     23.4 ms   avg =      9.0 ms   max =     40.9 ms</w:t>
-            </w:r>
-          </w:p>
-          <w:p>
-            <w:pPr>
-              <w:spacing w:before="0" w:after="0" w:line="240" w:lineRule="auto"/>
-              <w:jc w:val="left"/>
-            </w:pPr>
-            <w:r>
-              <w:rPr>
-                <w:rFonts w:ascii="Courier New" w:hAnsi="Courier New" w:cs="Courier New"/>
-                <w:sz w:val="16"/>
-                <w:szCs w:val="16"/>
-                <w:lang w:val="es-ES"/>
-              </w:rPr>
-              <w:t xml:space="preserve">DELETE /clientes             p95 =     17.8 ms   avg =      6.9 ms   max =     29.0 ms</w:t>
-            </w:r>
-          </w:p>
-          <w:p>
-            <w:pPr>
-              <w:spacing w:before="0" w:after="0" w:line="240" w:lineRule="auto"/>
-              <w:jc w:val="left"/>
-            </w:pPr>
-            <w:r>
-              <w:rPr>
-                <w:rFonts w:ascii="Courier New" w:hAnsi="Courier New" w:cs="Courier New"/>
-                <w:sz w:val="16"/>
-                <w:szCs w:val="16"/>
-                <w:lang w:val="es-ES"/>
-              </w:rPr>
-              <w:t xml:space="preserve">POST /autenticacion/login    p95 =   4010.4 ms   avg =   4008.4 ms   max =   4057.0 ms</w:t>
-            </w:r>
-          </w:p>
-        </w:tc>
-      </w:tr>
-    </w:tbl>
     <w:sectPr>
       <w:pgSz w:w="11906" w:h="16838" w:orient="portrait"/>
       <w:pgMar w:top="1134" w:right="1080" w:bottom="998" w:left="1080" w:header="720" w:footer="720" w:gutter="0"/>

</xml_diff>